<commit_message>
add about the author and style for the files
</commit_message>
<xml_diff>
--- a/styles/reference.docx
+++ b/styles/reference.docx
@@ -1264,6 +1264,22 @@
     <w:rPr>
       <w:sz w:val="22"/>
       <w:szCs w:val="22"/>
+    </w:rPr>
+  </w:style>
+  <w:style w:type="paragraph" w:customStyle="1" w:styleId="ObjectivesLead">
+    <w:name w:val="Objectives Lead"/>
+    <w:basedOn w:val="FirstParagraph"/>
+    <w:next w:val="Compact"/>
+    <w:qFormat/>
+    <w:pPr>
+      <w:keepNext/>
+      <w:spacing w:before="40" w:after="100"/>
+    </w:pPr>
+    <w:rPr>
+      <w:rFonts w:ascii="Aptos" w:hAnsi="Aptos" w:cs="Aptos"/>
+      <w:b/>
+      <w:bCs/>
+      <w:color w:val="2C3E50"/>
     </w:rPr>
   </w:style>
 </w:styles>

</xml_diff>